<commit_message>
Add FinPilot AI banking ops project to resume
Co-authored-by: Vishwa Gohil <vishwagit-oss@users.noreply.github.com>
</commit_message>
<xml_diff>
--- a/deliverables/Vishwa_Gohil_Resume_TCS.docx
+++ b/deliverables/Vishwa_Gohil_Resume_TCS.docx
@@ -87,7 +87,7 @@
           <w:rFonts w:ascii="Calibri" w:hAnsi="Calibri"/>
           <w:sz w:val="20"/>
         </w:rPr>
-        <w:t>React.js, Next.js, JavaScript, TypeScript, HTML5, CSS3, jQuery/Ajax</w:t>
+        <w:t>React.js, Next.js, JavaScript, TypeScript, HTML5, CSS3, jQuery/Ajax, Tailwind CSS</w:t>
       </w:r>
     </w:p>
     <w:p>
@@ -107,7 +107,7 @@
           <w:rFonts w:ascii="Calibri" w:hAnsi="Calibri"/>
           <w:sz w:val="20"/>
         </w:rPr>
-        <w:t>PHP (OOP), Laravel, REST APIs, SQL, MySQL, PostgreSQL</w:t>
+        <w:t>PHP (OOP), Laravel, Python, FastAPI, Node.js, REST APIs, SQL, MySQL, PostgreSQL</w:t>
       </w:r>
     </w:p>
     <w:p>
@@ -127,7 +127,7 @@
           <w:rFonts w:ascii="Calibri" w:hAnsi="Calibri"/>
           <w:sz w:val="20"/>
         </w:rPr>
-        <w:t>AWS (Cognito, RDS, SES, S3, EC2, CloudWatch, IAM, Lambda, API Gateway), Azure, Terraform, Ansible</w:t>
+        <w:t>AWS (Cognito, RDS, SES, S3, EC2, CloudWatch, IAM, Lambda, API Gateway), Azure, Terraform, Ansible, Docker</w:t>
       </w:r>
     </w:p>
     <w:p>
@@ -140,14 +140,14 @@
           <w:b/>
           <w:sz w:val="20"/>
         </w:rPr>
-        <w:t xml:space="preserve">Practices: </w:t>
+        <w:t xml:space="preserve">AI &amp; Practices: </w:t>
       </w:r>
       <w:r>
         <w:rPr>
           <w:rFonts w:ascii="Calibri" w:hAnsi="Calibri"/>
           <w:sz w:val="20"/>
         </w:rPr>
-        <w:t>Agile/JIRA, code review &amp; Git workflows, production support/on-call, documentation, workflow automation, stakeholder communication, Git/GitHub</w:t>
+        <w:t>RAG/Generative AI, OpenAI/Gemini integration, Agile/JIRA, Git workflows, production support/on-call, documentation</w:t>
       </w:r>
     </w:p>
     <w:p>
@@ -430,7 +430,7 @@
           <w:b/>
           <w:sz w:val="20"/>
         </w:rPr>
-        <w:t>ShopStyle — Laravel E-commerce | Live + GitHub</w:t>
+        <w:t>FinPilot — AI Banking Ops Assistant | GitHub</w:t>
       </w:r>
       <w:r>
         <w:rPr>
@@ -439,6 +439,76 @@
           <w:sz w:val="20"/>
         </w:rPr>
         <w:tab/>
+        <w:t>2025</w:t>
+      </w:r>
+    </w:p>
+    <w:p>
+      <w:pPr>
+        <w:pStyle w:val="ListBullet"/>
+        <w:spacing w:after="40"/>
+        <w:ind w:left="360"/>
+      </w:pPr>
+      <w:r>
+        <w:rPr>
+          <w:rFonts w:ascii="Calibri" w:hAnsi="Calibri"/>
+          <w:sz w:val="20"/>
+        </w:rPr>
+        <w:t>Built a full-stack AI banking operations assistant using Next.js 14, React, TypeScript, Node.js API routes, and Python FastAPI.</w:t>
+      </w:r>
+    </w:p>
+    <w:p>
+      <w:pPr>
+        <w:pStyle w:val="ListBullet"/>
+        <w:spacing w:after="40"/>
+        <w:ind w:left="360"/>
+      </w:pPr>
+      <w:r>
+        <w:rPr>
+          <w:rFonts w:ascii="Calibri" w:hAnsi="Calibri"/>
+          <w:sz w:val="20"/>
+        </w:rPr>
+        <w:t>Implemented RAG-style retrieval over accounts, transactions, and policy data with OpenAI/Gemini integration and offline fallback.</w:t>
+      </w:r>
+    </w:p>
+    <w:p>
+      <w:pPr>
+        <w:pStyle w:val="ListBullet"/>
+        <w:spacing w:after="40"/>
+        <w:ind w:left="360"/>
+      </w:pPr>
+      <w:r>
+        <w:rPr>
+          <w:rFonts w:ascii="Calibri" w:hAnsi="Calibri"/>
+          <w:sz w:val="20"/>
+        </w:rPr>
+        <w:t>Delivered alert triage queue, fraud/dispute analyst dashboard, grounded AI chat, and audit trail for banking ops workflows.</w:t>
+      </w:r>
+    </w:p>
+    <w:p>
+      <w:pPr>
+        <w:pStyle w:val="ListBullet"/>
+        <w:spacing w:after="40"/>
+        <w:ind w:left="360"/>
+      </w:pPr>
+      <w:r>
+        <w:rPr>
+          <w:rFonts w:ascii="Calibri" w:hAnsi="Calibri"/>
+          <w:sz w:val="20"/>
+        </w:rPr>
+        <w:t>GitHub: github.com/vishwagit-oss/FinPilot_LLM</w:t>
+      </w:r>
+    </w:p>
+    <w:p>
+      <w:pPr>
+        <w:spacing w:after="40"/>
+      </w:pPr>
+      <w:r>
+        <w:rPr>
+          <w:rFonts w:ascii="Calibri" w:hAnsi="Calibri"/>
+          <w:b/>
+          <w:sz w:val="20"/>
+        </w:rPr>
+        <w:t>ShopStyle — Laravel E-commerce | Live + GitHub</w:t>
       </w:r>
     </w:p>
     <w:p>
@@ -480,14 +550,6 @@
           <w:sz w:val="20"/>
         </w:rPr>
         <w:t>Terraform Multi-Tier Azure Architecture | GitHub</w:t>
-      </w:r>
-      <w:r>
-        <w:rPr>
-          <w:rFonts w:ascii="Calibri" w:hAnsi="Calibri"/>
-          <w:i/>
-          <w:sz w:val="20"/>
-        </w:rPr>
-        <w:tab/>
       </w:r>
     </w:p>
     <w:p>
@@ -651,7 +713,7 @@
           <w:rFonts w:ascii="Calibri" w:hAnsi="Calibri"/>
           <w:sz w:val="20"/>
         </w:rPr>
-        <w:t>Legally authorized to work in Canada. AWS Certified Developer – Associate (DVA-C02): In progress (not yet completed).</w:t>
+        <w:t>Legally authorized to work in Canada (Open Work Permit, valid until January 2029). AWS Certified Developer – Associate (DVA-C02): In progress.</w:t>
       </w:r>
     </w:p>
     <w:sectPr>

</xml_diff>